<commit_message>
refactor(legal): complete legal overhaul across all 6 dossiers & dajing.html per expert review (Article 53/31 general meeting framework, corrected fund characterization, zero Article 26/unverified rulings)
</commit_message>
<xml_diff>
--- a/富宇大境A2獨立分割全權委任授權書.docx
+++ b/富宇大境A2獨立分割全權委任授權書.docx
@@ -30,7 +30,7 @@
           <w:color w:val="8C8273"/>
           <w:sz w:val="16"/>
         </w:rPr>
-        <w:t>依據《民法》第 528 條委任契約與《公寓大廈管理條例》第 26 條規定簽署立案</w:t>
+        <w:t>依據《民法》第 528 條、第 534 條專案委任契約與《公寓大廈管理條例》第 53 條、第 31 條規定簽署立案</w:t>
       </w:r>
     </w:p>
     <w:tbl>
@@ -72,7 +72,7 @@
               </w:rPr>
               <w:t>【委任意旨與受任人指派】</w:t>
               <w:br/>
-              <w:t>立委任授權書人係台中市沙鹿區「富宇大境（A2 區）」全體區分所有權人（龍社路 593、595、597、599、601、603 號共 6 戶）。緣於本區出入與生活機能完全獨立，為行使《公寓大廈管理條例》第 26 條第 1 項賦予之法定獨立分割自治權利，全體委任人特此共同推選並全權委任本區區權人 【 廖倫豪（沙鹿區龍社路 595 號 A17 棟）】為專案受任召集人兼法定代理人，全權代表本區全體 6 戶行使以下專案法定職權：</w:t>
+              <w:t>立委任授權書人係台中市沙鹿區「富宇大境（A2 區）」全體區分所有權人（沙鹿區龍社路 593、595、597、599、601、603 號共 6 戶）。緣於本區出入與生活機能完全獨立，為依《公寓大廈管理條例》第 53 條、第 31 條推動本區獨立分割與管理分流自治，全體委任人特此共同推選並全權委任本區區權人 【 廖倫豪（沙鹿區龍社路 595 號 A17 棟）】為專案受任召集人兼法定代理人，全權代表本區全體 6 戶行使以下專案法定職權：</w:t>
             </w:r>
           </w:p>
         </w:tc>
@@ -89,7 +89,7 @@
           <w:color w:val="B8860B"/>
           <w:sz w:val="16"/>
         </w:rPr>
-        <w:t>第一條（提案審議與協商代表權）：</w:t>
+        <w:t>第一條（提案審議與大會對接代表權）：</w:t>
       </w:r>
       <w:r>
         <w:rPr>
@@ -97,7 +97,7 @@
           <w:color w:val="1A1D20"/>
           <w:sz w:val="16"/>
         </w:rPr>
-        <w:t>全權代表本區 6 戶向富宇大地社區管理委員會提出獨立分割正式公文，列席管委會例行會議進行協商陳述，並代表簽署《公共基金與專款資產分割清算協議書》。</w:t>
+        <w:t>全權代表本區 6 戶向富宇大地社區管理委員會提出獨立分割正式公文，列席管委會例行會議進行協商陳述，並協助推動將本分割案及規約第二條變更案排入富宇大地全體區分所有權人會議審議。</w:t>
       </w:r>
     </w:p>
     <w:p>
@@ -111,7 +111,7 @@
           <w:color w:val="B8860B"/>
           <w:sz w:val="16"/>
         </w:rPr>
-        <w:t>第二條（公款移交與銀行接收權）：</w:t>
+        <w:t>第二條（清算協議草擬與協商代表權）：</w:t>
       </w:r>
       <w:r>
         <w:rPr>
@@ -119,7 +119,7 @@
           <w:color w:val="1A1D20"/>
           <w:sz w:val="16"/>
         </w:rPr>
-        <w:t>全權代表本區向新光銀行沙鹿分行辦理「A2 大境定存單 NT$ 220,231 元」及富宇建設交屋管理基金「NT$ 60,000 元」（合計逾 28 萬元）之存單抬頭更名、解約與撥付接收全般手續。</w:t>
+        <w:t>全權代表本區就新光銀行 A2 大境定存單（NT$ 220,231 元加計孳息）及交屋管理基金（NT$ 60,000 元，合計逾 28 萬元）與富宇大地管委會協商草擬《資產分割清算協議書》，俟大會通過後代表對接移交。</w:t>
       </w:r>
     </w:p>
     <w:p>
@@ -133,7 +133,7 @@
           <w:color w:val="B8860B"/>
           <w:sz w:val="16"/>
         </w:rPr>
-        <w:t>第三條（主管機關行政報備權）：</w:t>
+        <w:t>第三條（主管機關行政程序協力權）：</w:t>
       </w:r>
       <w:r>
         <w:rPr>
@@ -141,7 +141,7 @@
           <w:color w:val="1A1D20"/>
           <w:sz w:val="16"/>
         </w:rPr>
-        <w:t>全權代表本區檢具法定卷宗向台中市龍井區公所、台中市政府住宅處申辦富宇大境獨立管委會備查，領取報備證明、統一編號編配通知書及開立管委會公庫專戶。</w:t>
+        <w:t>全權代表本區檢具法定卷宗與大會會議紀錄，向主管機關區公所申辦富宇大境獨立管委會備查，配合辦理報備證明與國稅局新統一編號申領全般公務程序。</w:t>
       </w:r>
     </w:p>
     <w:p>
@@ -163,7 +163,7 @@
           <w:color w:val="1A1D20"/>
           <w:sz w:val="16"/>
         </w:rPr>
-        <w:t>本委任授權僅嚴格限於本案獨立分割、公款迎回與公所報備之法定程序；絕不包含亦絕無任何委任人私人不動產買賣、抵押、借貸或處分之權利，特此聲明以昭公信。</w:t>
+        <w:t>本委任授權僅嚴格限於本案獨立分割、公款移交協商與公所報備之法定程序；絕不包含亦絕無任何委任人私人不動產買賣、抵押、借貸或處分之權利，特此聲明以昭公信。</w:t>
       </w:r>
     </w:p>
     <w:p>
@@ -1071,7 +1071,43 @@
         <w:color w:val="8C8273"/>
         <w:sz w:val="17"/>
       </w:rPr>
-      <w:t>受任召集人：廖倫豪  ｜  富宇大境（A2 區）全體區權人專案全權委任授權書  ｜  第 1 頁 / 共 1 頁</w:t>
+      <w:t xml:space="preserve">報告人：廖倫豪  ｜  第 </w:t>
+    </w:r>
+    <w:fldSimple w:instr="PAGE">
+      <w:r>
+        <w:rPr>
+          <w:rFonts w:ascii="PingFang TC" w:eastAsia="PingFang TC"/>
+          <w:sz w:val="17"/>
+          <w:color w:val="8C8273"/>
+        </w:rPr>
+        <w:t>1</w:t>
+      </w:r>
+    </w:fldSimple>
+    <w:r>
+      <w:rPr>
+        <w:rFonts w:ascii="PingFang TC" w:hAnsi="PingFang TC"/>
+        <w:color w:val="8C8273"/>
+        <w:sz w:val="17"/>
+      </w:rPr>
+      <w:t xml:space="preserve"> 頁  /  共 </w:t>
+    </w:r>
+    <w:fldSimple w:instr="NUMPAGES">
+      <w:r>
+        <w:rPr>
+          <w:rFonts w:ascii="PingFang TC" w:eastAsia="PingFang TC"/>
+          <w:sz w:val="17"/>
+          <w:color w:val="8C8273"/>
+        </w:rPr>
+        <w:t>1</w:t>
+      </w:r>
+    </w:fldSimple>
+    <w:r>
+      <w:rPr>
+        <w:rFonts w:ascii="PingFang TC" w:hAnsi="PingFang TC"/>
+        <w:color w:val="8C8273"/>
+        <w:sz w:val="17"/>
+      </w:rPr>
+      <w:t xml:space="preserve"> 頁</w:t>
     </w:r>
   </w:p>
 </w:ftr>

</xml_diff>